<commit_message>
Fix URLs, add qvzcontact placeholder, revert toggle overcorrection, clean up UI
- Correct HR1 URL (use full_month in path and filename)
- Correct X02 URL (quarterly month, correct dataset path, .xls extension)
- Add OECD API download links (UE, Inactivity, Employment)
- Replace hardcoded names in ManualDB.docx header with qvzcontact placeholder
- Blank default for contact name inputs (not pre-filled with names)
- Restyle contact input as sentence: "OFFICIAL-SENSITIVE ... please contact ___"
- Integrate download links into existing grey file status tags (no separate link section)
- Add hint: "Click a grey button to download data for {month}"
- Pre-populate manual tab reference month from auto-detected value
- Revert toggle overcorrection: Summary/Top Ten no longer affected by vac/pay toggles
  (toggles only affect Dashboard, as intended)

https://claude.ai/code/session_01USShV1LyhK3mB5ZoMsC9Cw
</commit_message>
<xml_diff>
--- a/labour-market-stats-brief/utils/ManualDB.docx
+++ b/labour-market-stats-brief/utils/ManualDB.docx
@@ -6981,6 +6981,10 @@
     <w:sectPr>
       <w:headerReference w:type="default" r:id="rId14"/>
       <w:footerReference w:type="default" r:id="rId15"/>
+      <w:headerReference w:type="first" r:id="rId18"/>
+      <w:headerReference w:type="even" r:id="rId19"/>
+      <w:footerReference w:type="first" r:id="rId20"/>
+      <w:footerReference w:type="even" r:id="rId21"/>
       <w:endnotePr>
         <w:numFmt w:val="decimal"/>
       </w:endnotePr>
@@ -7183,6 +7187,26 @@
 </w:ftr>
 </file>
 
+<file path=word/footer2.xml><?xml version="1.0" encoding="utf-8"?>
+<w:ftr xmlns:m="http://schemas.openxmlformats.org/officeDocument/2006/math" xmlns:mc="http://schemas.openxmlformats.org/markup-compatibility/2006" xmlns:mo="http://schemas.microsoft.com/office/mac/office/2008/main" xmlns:mv="urn:schemas-microsoft-com:mac:vml" xmlns:o="urn:schemas-microsoft-com:office:office" xmlns:r="http://schemas.openxmlformats.org/officeDocument/2006/relationships" xmlns:v="urn:schemas-microsoft-com:vml" xmlns:w10="urn:schemas-microsoft-com:office:word" xmlns:w14="http://schemas.microsoft.com/office/word/2010/wordml" xmlns:w="http://schemas.openxmlformats.org/wordprocessingml/2006/main" xmlns:wne="http://schemas.microsoft.com/office/word/2006/wordml" xmlns:wp14="http://schemas.microsoft.com/office/word/2010/wordprocessingDrawing" xmlns:wp="http://schemas.openxmlformats.org/drawingml/2006/wordprocessingDrawing" xmlns:wpc="http://schemas.microsoft.com/office/word/2010/wordprocessingCanvas" xmlns:wpg="http://schemas.microsoft.com/office/word/2010/wordprocessingGroup" xmlns:wpi="http://schemas.microsoft.com/office/word/2010/wordprocessingInk" xmlns:wps="http://schemas.microsoft.com/office/word/2010/wordprocessingShape" mc:Ignorable="w14 wp14">
+  <w:p>
+    <w:pPr>
+      <w:pStyle w:val="Footer"/>
+    </w:pPr>
+  </w:p>
+</w:ftr>
+</file>
+
+<file path=word/footer3.xml><?xml version="1.0" encoding="utf-8"?>
+<w:ftr xmlns:m="http://schemas.openxmlformats.org/officeDocument/2006/math" xmlns:mc="http://schemas.openxmlformats.org/markup-compatibility/2006" xmlns:mo="http://schemas.microsoft.com/office/mac/office/2008/main" xmlns:mv="urn:schemas-microsoft-com:mac:vml" xmlns:o="urn:schemas-microsoft-com:office:office" xmlns:r="http://schemas.openxmlformats.org/officeDocument/2006/relationships" xmlns:v="urn:schemas-microsoft-com:vml" xmlns:w10="urn:schemas-microsoft-com:office:word" xmlns:w14="http://schemas.microsoft.com/office/word/2010/wordml" xmlns:w="http://schemas.openxmlformats.org/wordprocessingml/2006/main" xmlns:wne="http://schemas.microsoft.com/office/word/2006/wordml" xmlns:wp14="http://schemas.microsoft.com/office/word/2010/wordprocessingDrawing" xmlns:wp="http://schemas.openxmlformats.org/drawingml/2006/wordprocessingDrawing" xmlns:wpc="http://schemas.microsoft.com/office/word/2010/wordprocessingCanvas" xmlns:wpg="http://schemas.microsoft.com/office/word/2010/wordprocessingGroup" xmlns:wpi="http://schemas.microsoft.com/office/word/2010/wordprocessingInk" xmlns:wps="http://schemas.microsoft.com/office/word/2010/wordprocessingShape" mc:Ignorable="w14 wp14">
+  <w:p>
+    <w:pPr>
+      <w:pStyle w:val="Footer"/>
+    </w:pPr>
+  </w:p>
+</w:ftr>
+</file>
+
 <file path=word/footnotes.xml><?xml version="1.0" encoding="utf-8"?>
 <w:footnotes xmlns:wpc="http://schemas.microsoft.com/office/word/2010/wordprocessingCanvas" xmlns:cx="http://schemas.microsoft.com/office/drawing/2014/chartex" xmlns:cx1="http://schemas.microsoft.com/office/drawing/2015/9/8/chartex" xmlns:cx2="http://schemas.microsoft.com/office/drawing/2015/10/21/chartex" xmlns:cx3="http://schemas.microsoft.com/office/drawing/2016/5/9/chartex" xmlns:cx4="http://schemas.microsoft.com/office/drawing/2016/5/10/chartex" xmlns:cx5="http://schemas.microsoft.com/office/drawing/2016/5/11/chartex" xmlns:cx6="http://schemas.microsoft.com/office/drawing/2016/5/12/chartex" xmlns:cx7="http://schemas.microsoft.com/office/drawing/2016/5/13/chartex" xmlns:cx8="http://schemas.microsoft.com/office/drawing/2016/5/14/chartex" xmlns:mc="http://schemas.openxmlformats.org/markup-compatibility/2006" xmlns:aink="http://schemas.microsoft.com/office/drawing/2016/ink" xmlns:am3d="http://schemas.microsoft.com/office/drawing/2017/model3d" xmlns:o="urn:schemas-microsoft-com:office:office" xmlns:oel="http://schemas.microsoft.com/office/2019/extlst" xmlns:r="http://schemas.openxmlformats.org/officeDocument/2006/relationships" xmlns:m="http://schemas.openxmlformats.org/officeDocument/2006/math" xmlns:v="urn:schemas-microsoft-com:vml" xmlns:wp14="http://schemas.microsoft.com/office/word/2010/wordprocessingDrawing" xmlns:wp="http://schemas.openxmlformats.org/drawingml/2006/wordprocessingDrawing" xmlns:w10="urn:schemas-microsoft-com:office:word" xmlns:w="http://schemas.openxmlformats.org/wordprocessingml/2006/main" xmlns:w14="http://schemas.microsoft.com/office/word/2010/wordml" xmlns:w15="http://schemas.microsoft.com/office/word/2012/wordml" xmlns:w16cex="http://schemas.microsoft.com/office/word/2018/wordml/cex" xmlns:w16cid="http://schemas.microsoft.com/office/word/2016/wordml/cid" xmlns:w16="http://schemas.microsoft.com/office/word/2018/wordml" xmlns:w16du="http://schemas.microsoft.com/office/word/2023/wordml/word16du" xmlns:w16sdtdh="http://schemas.microsoft.com/office/word/2020/wordml/sdtdatahash" xmlns:w16sdtfl="http://schemas.microsoft.com/office/word/2024/wordml/sdtformatlock" xmlns:w16se="http://schemas.microsoft.com/office/word/2015/wordml/symex" xmlns:wpg="http://schemas.microsoft.com/office/word/2010/wordprocessingGroup" xmlns:wpi="http://schemas.microsoft.com/office/word/2010/wordprocessingInk" xmlns:wne="http://schemas.microsoft.com/office/word/2006/wordml" xmlns:wps="http://schemas.microsoft.com/office/word/2010/wordprocessingShape" mc:Ignorable="w14 w15 w16se w16cid w16 w16cex w16sdtdh w16sdtfl w16du wp14">
   <w:footnote w:type="separator" w:id="-1">
@@ -7341,7 +7365,7 @@
                               <w:color w:val="000000"/>
                               <w:sz w:val="20"/>
                             </w:rPr>
-                            <w:t>Zaynah Asad</w:t>
+                            <w:t>qvzcontact</w:t>
                           </w:r>
                           <w:r>
                             <w:rPr>
@@ -7349,7 +7373,7 @@
                               <w:color w:val="000000"/>
                               <w:sz w:val="20"/>
                             </w:rPr>
-                            <w:t xml:space="preserve"> and Jevan Reynolds</w:t>
+                            <w:t xml:space="preserve"/>
                           </w:r>
                         </w:p>
                       </w:txbxContent>
@@ -7447,7 +7471,7 @@
                         <w:color w:val="000000"/>
                         <w:sz w:val="20"/>
                       </w:rPr>
-                      <w:t>Zaynah Asad</w:t>
+                      <w:t>qvzcontact</w:t>
                     </w:r>
                     <w:r>
                       <w:rPr>
@@ -7455,7 +7479,7 @@
                         <w:color w:val="000000"/>
                         <w:sz w:val="20"/>
                       </w:rPr>
-                      <w:t xml:space="preserve"> and Jevan Reynolds</w:t>
+                      <w:t xml:space="preserve"/>
                     </w:r>
                   </w:p>
                 </w:txbxContent>
@@ -7466,6 +7490,26 @@
         </mc:Fallback>
       </mc:AlternateContent>
     </w:r>
+  </w:p>
+</w:hdr>
+</file>
+
+<file path=word/header2.xml><?xml version="1.0" encoding="utf-8"?>
+<w:hdr xmlns:m="http://schemas.openxmlformats.org/officeDocument/2006/math" xmlns:mc="http://schemas.openxmlformats.org/markup-compatibility/2006" xmlns:mo="http://schemas.microsoft.com/office/mac/office/2008/main" xmlns:mv="urn:schemas-microsoft-com:mac:vml" xmlns:o="urn:schemas-microsoft-com:office:office" xmlns:r="http://schemas.openxmlformats.org/officeDocument/2006/relationships" xmlns:v="urn:schemas-microsoft-com:vml" xmlns:w10="urn:schemas-microsoft-com:office:word" xmlns:w14="http://schemas.microsoft.com/office/word/2010/wordml" xmlns:w="http://schemas.openxmlformats.org/wordprocessingml/2006/main" xmlns:wne="http://schemas.microsoft.com/office/word/2006/wordml" xmlns:wp14="http://schemas.microsoft.com/office/word/2010/wordprocessingDrawing" xmlns:wp="http://schemas.openxmlformats.org/drawingml/2006/wordprocessingDrawing" xmlns:wpc="http://schemas.microsoft.com/office/word/2010/wordprocessingCanvas" xmlns:wpg="http://schemas.microsoft.com/office/word/2010/wordprocessingGroup" xmlns:wpi="http://schemas.microsoft.com/office/word/2010/wordprocessingInk" xmlns:wps="http://schemas.microsoft.com/office/word/2010/wordprocessingShape" mc:Ignorable="w14 wp14">
+  <w:p>
+    <w:pPr>
+      <w:pStyle w:val="Header"/>
+    </w:pPr>
+  </w:p>
+</w:hdr>
+</file>
+
+<file path=word/header3.xml><?xml version="1.0" encoding="utf-8"?>
+<w:hdr xmlns:m="http://schemas.openxmlformats.org/officeDocument/2006/math" xmlns:mc="http://schemas.openxmlformats.org/markup-compatibility/2006" xmlns:mo="http://schemas.microsoft.com/office/mac/office/2008/main" xmlns:mv="urn:schemas-microsoft-com:mac:vml" xmlns:o="urn:schemas-microsoft-com:office:office" xmlns:r="http://schemas.openxmlformats.org/officeDocument/2006/relationships" xmlns:v="urn:schemas-microsoft-com:vml" xmlns:w10="urn:schemas-microsoft-com:office:word" xmlns:w14="http://schemas.microsoft.com/office/word/2010/wordml" xmlns:w="http://schemas.openxmlformats.org/wordprocessingml/2006/main" xmlns:wne="http://schemas.microsoft.com/office/word/2006/wordml" xmlns:wp14="http://schemas.microsoft.com/office/word/2010/wordprocessingDrawing" xmlns:wp="http://schemas.openxmlformats.org/drawingml/2006/wordprocessingDrawing" xmlns:wpc="http://schemas.microsoft.com/office/word/2010/wordprocessingCanvas" xmlns:wpg="http://schemas.microsoft.com/office/word/2010/wordprocessingGroup" xmlns:wpi="http://schemas.microsoft.com/office/word/2010/wordprocessingInk" xmlns:wps="http://schemas.microsoft.com/office/word/2010/wordprocessingShape" mc:Ignorable="w14 wp14">
+  <w:p>
+    <w:pPr>
+      <w:pStyle w:val="Header"/>
+    </w:pPr>
   </w:p>
 </w:hdr>
 </file>

</xml_diff>

<commit_message>
Add ** markers for OECD cells with older period data and auto-footnote
When a country's metric comes from an older quarter than the row's main
time period, the cell value is now appended with ** and an auto-generated
footnote lists which specific data points are from older periods (e.g.
"**Latest Germany unemployment rate from 2025-Q2."). Applied to both
the preview UI and Word output via qvzoecdstalenote placeholder.

https://claude.ai/code/session_01USShV1LyhK3mB5ZoMsC9Cw
</commit_message>
<xml_diff>
--- a/labour-market-stats-brief/utils/ManualDB.docx
+++ b/labour-market-stats-brief/utils/ManualDB.docx
@@ -7126,6 +7126,27 @@
           <w:szCs w:val="28"/>
         </w:rPr>
         <w:t>16 rather than 15.</w:t>
+      </w:r>
+    </w:p>
+    <w:p>
+      <w:pPr>
+        <w:spacing w:before="0" w:after="0" w:line="276" w:lineRule="auto"/>
+        <w:rPr>
+          <w:rFonts w:eastAsia="Arial"/>
+          <w:sz w:val="22"/>
+          <w:szCs w:val="28"/>
+        </w:rPr>
+      </w:pPr>
+      <w:r>
+        <w:rPr>
+          <w:rFonts w:eastAsia="Arial"/>
+          <w:b/>
+          <w:bCs/>
+          <w:sz w:val="22"/>
+          <w:szCs w:val="28"/>
+          <w:vertAlign w:val="superscript"/>
+        </w:rPr>
+        <w:t>qvzoecdstalenote</w:t>
       </w:r>
     </w:p>
     <w:p/>

</xml_diff>

<commit_message>
Use ONS data for UK row in OECD table, fix template font sizes
UK row now uses domestic ONS rates (unemp_rt_cur, emp_rt_cur, inact_rt_cur)
from the A01 calculations instead of OECD-sourced UK values, matching the
footnote "Latest UK data from ONS Labour Force Survey." The manual_month
is converted to quarter format (e.g. "dec2025" -> "2025-Q4") for the
time period column.

Also fixed Word template font sizing: stale note paragraph no longer
inherits bold from footnote superscript, bullet placeholders now have
explicit 11pt size matching footnotes.

https://claude.ai/code/session_01USShV1LyhK3mB5ZoMsC9Cw
</commit_message>
<xml_diff>
--- a/labour-market-stats-brief/utils/ManualDB.docx
+++ b/labour-market-stats-brief/utils/ManualDB.docx
@@ -7140,7 +7140,7 @@
       <w:r>
         <w:rPr>
           <w:rFonts w:eastAsia="Arial"/>
-          <w:b/>
+          <w:b w:val="0"/>
           <w:bCs/>
           <w:sz w:val="22"/>
           <w:szCs w:val="28"/>
@@ -7155,6 +7155,9 @@
         <w:pStyle w:val="ListParagraph"/>
       </w:pPr>
       <w:r>
+        <w:rPr>
+          <w:sz w:val="22"/>
+        </w:rPr>
         <w:t>qvzoecdbullet1</w:t>
       </w:r>
     </w:p>
@@ -7163,6 +7166,9 @@
         <w:pStyle w:val="ListParagraph"/>
       </w:pPr>
       <w:r>
+        <w:rPr>
+          <w:sz w:val="22"/>
+        </w:rPr>
         <w:t>qvzoecdbullet2</w:t>
       </w:r>
     </w:p>
@@ -7171,6 +7177,9 @@
         <w:pStyle w:val="ListParagraph"/>
       </w:pPr>
       <w:r>
+        <w:rPr>
+          <w:sz w:val="22"/>
+        </w:rPr>
         <w:t>qvzoecdbullet3</w:t>
       </w:r>
     </w:p>

</xml_diff>